<commit_message>
feat: extend synthetic corpus to storylines B-E
- Spec split into one timeline file per storyline; documents can belong
  to several storylines and links cross them (ground truth records home
  and also-in membership)
- Storylines B (Mill Lane culvert vs water main), C (Pond 2 attenuation),
  D (roundabout surfacing substitution) and E (project history)
- Storyline A minutes #7 and #10 corrected for consistency with B
- Drawing renderer generalised (culvert, pond, layout, roundabout,
  generic views); new BoQ and programme spreadsheets
- Corpus: 47 documents, 62 revisions, 64 files, 36 links; planted
  discrepancies, legacy filenames, superseded-by-new-number and
  correct-not-latest cases
- Excel dates extracted as ISO dates

Co-Authored-By: Claude Opus 5.5 <noreply@anthropic.com>
</commit_message>
<xml_diff>
--- a/corpus/KVL Project/01 Management/Meetings/2025/KVL-CGC-100-MM-G-0010_P01 - Progress Meeting No. 10 Minutes.docx
+++ b/corpus/KVL Project/01 Management/Meetings/2025/KVL-CGC-100-MM-G-0010_P01 - Progress Meeting No. 10 Minutes.docx
@@ -569,7 +569,7 @@
           </w:tcPr>
           <w:p>
             <w:r>
-              <w:t>Response from Northvale Water on the water main level is still awaited.</w:t>
+              <w:t>ADM response to RFI-0013 issued 15 July - culvert to be lowered and a protection slab provided over the water main. Revised culvert drawing and slab details due 20 August. Northvale Water acceptance of the slab proposal is still awaited.</w:t>
             </w:r>
           </w:p>
         </w:tc>
@@ -579,7 +579,7 @@
           </w:tcPr>
           <w:p>
             <w:r>
-              <w:t>Chase Northvale Water</w:t>
+              <w:t>Chase Northvale Water for acceptance of the protection slab</w:t>
             </w:r>
           </w:p>
         </w:tc>

</xml_diff>